<commit_message>
Companion: rewrite Section 7 (rules) for depth and voice consistency
Co-Authored-By: Claude Opus 4.8 <noreply@anthropic.com>
Claude-Session: https://claude.ai/code/session_01JCcmUyJoKcg4A35MRUqzX3
</commit_message>
<xml_diff>
--- a/book/companion/KDP-interior-6x9.docx
+++ b/book/companion/KDP-interior-6x9.docx
@@ -3662,31 +3662,31 @@
         <w:pStyle w:val="Body"/>
       </w:pPr>
       <w:r>
-        <w:t>The short answer is that coffee is one of a handful of substances a health and religious code called the "Word of Wisdom" asks members to avoid. If you were expecting a dramatic reason, there isn't one — coffee simply falls under the code's ban on "hot drinks," which the church has long understood to mean coffee and tea.</w:t>
-      </w:r>
-    </w:p>
-    <w:p>
-      <w:pPr>
-        <w:pStyle w:val="Body"/>
-      </w:pPr>
-      <w:r>
-        <w:t>The rule dates back to 1833, when Joseph Smith recorded a revelation counseling members on what to put into their bodies. Over time it hardened from friendly advice into a firm expectation, and today it is tied to the temple recommend — the interview-based credential that lets a member enter the temple. In practice, that makes abstaining from coffee a marker of full standing in the faith.</w:t>
-      </w:r>
-    </w:p>
-    <w:p>
-      <w:pPr>
-        <w:pStyle w:val="Body"/>
-      </w:pPr>
-      <w:r>
-        <w:t>What often surprises outsiders is how little internal debate there is about it. To a committed Latter-day Saint, not drinking coffee isn't a daily act of willpower or a sacrifice they feel keenly. Most were raised never tasting it, so there is nothing to give up. The habit is simply absent, the way many people never acquire a taste for something they were never offered.</w:t>
-      </w:r>
-    </w:p>
-    <w:p>
-      <w:pPr>
-        <w:pStyle w:val="Body"/>
-      </w:pPr>
-      <w:r>
-        <w:t>It also helps to know that the "why" for most members is less about caffeine chemistry and more about covenant and identity. Following the Word of Wisdom is a small, repeated way of signaling belonging — a shared discipline that quietly sets the community apart. When you understand it as an identity practice rather than a nutrition rule, the coffee ban makes a good deal more sense.</w:t>
+        <w:t>Because of a religious health code called the Word of Wisdom, which Latter-day Saints understand as a commandment from God — and which specifically singles out coffee.</w:t>
+      </w:r>
+    </w:p>
+    <w:p>
+      <w:pPr>
+        <w:pStyle w:val="Body"/>
+      </w:pPr>
+      <w:r>
+        <w:t>The short version is that in 1833 the church's founder, Joseph Smith, recorded a revelation counseling against "hot drinks," and church leaders came to define that phrase, authoritatively, as coffee and tea. So for a committed Latter-day Saint, passing on coffee isn't a health opinion or a personal preference they might reconsider on a rough Monday morning; it's part of keeping a covenant, and it's tied to their standing in the church. Living the Word of Wisdom is one of the questions a member must answer to receive a "temple recommend," the card that lets them enter the faith's most sacred buildings.</w:t>
+      </w:r>
+    </w:p>
+    <w:p>
+      <w:pPr>
+        <w:pStyle w:val="Body"/>
+      </w:pPr>
+      <w:r>
+        <w:t>What surprises outsiders is how matter-of-fact it all is. A devout Latter-day Saint has typically never tasted coffee in their life and doesn't feel deprived, any more than a lifelong vegetarian aches for a steak. It's simply part of who they are — a daily, visible marker of belonging to a peculiar people.</w:t>
+      </w:r>
+    </w:p>
+    <w:p>
+      <w:pPr>
+        <w:pStyle w:val="Body"/>
+      </w:pPr>
+      <w:r>
+        <w:t>It's worth adding that the "why" is less about caffeine chemistry than about obedience and identity. Members don't generally claim coffee is uniquely poisonous; they abstain because they believe God asked them to, and because that small daily choice quietly sets them apart. That framing explains the rule better than any nutrition label — and it's also the key to the apparent contradiction people love to point out, which is the very next question.</w:t>
       </w:r>
     </w:p>
     <w:p>
@@ -3702,31 +3702,40 @@
         <w:pStyle w:val="Body"/>
       </w:pPr>
       <w:r>
-        <w:t>Yes, and this trips up almost everyone. The Word of Wisdom prohibits coffee and tea specifically, not caffeine as a chemical. So a caffeinated cola, an energy drink, or a chocolate bar are all technically within the rules, while a decaffeinated coffee is not.</w:t>
-      </w:r>
-    </w:p>
-    <w:p>
-      <w:pPr>
-        <w:pStyle w:val="Body"/>
-      </w:pPr>
-      <w:r>
-        <w:t>This strikes many people as inconsistent, and it's a fair observation. If the concern were caffeine, the lines would be drawn differently. But the prohibition was written as a list of substances — "hot drinks," alcohol, tobacco — not as a principle about stimulants. The church has confirmed over the years that the code does not extend to caffeinated soft drinks, even as some individual members choose to avoid caffeine anyway out of personal preference.</w:t>
-      </w:r>
-    </w:p>
-    <w:p>
-      <w:pPr>
-        <w:pStyle w:val="Body"/>
-      </w:pPr>
-      <w:r>
-        <w:t>The result is a genuine cultural quirk. In heavily Latter-day Saint areas like Utah, caffeinated soda occupies the social niche that coffee holds elsewhere — the pick-me-up, the treat, the thing you order when you meet a friend. That single permitted indulgence has grown into an entire regional food culture, which the next few questions explore.</w:t>
-      </w:r>
-    </w:p>
-    <w:p>
-      <w:pPr>
-        <w:pStyle w:val="Body"/>
-      </w:pPr>
-      <w:r>
-        <w:t>So if you offer a Latter-day Saint friend a Diet Coke, you're on safe ground. Offer them an espresso, and you've crossed a line they take seriously. It feels arbitrary from the outside, but it follows the letter of a text rather than a theory about health.</w:t>
+        <w:t xml:space="preserve">Yes, and you've spotted the single most-cited "gotcha" about Latter-day Saint life. It's real, and the explanation is refreshingly honest: the rule is about </w:t>
+      </w:r>
+      <w:r>
+        <w:rPr>
+          <w:i/>
+        </w:rPr>
+        <w:t>coffee and tea specifically</w:t>
+      </w:r>
+      <w:r>
+        <w:t>, not caffeine in general.</w:t>
+      </w:r>
+    </w:p>
+    <w:p>
+      <w:pPr>
+        <w:pStyle w:val="Body"/>
+      </w:pPr>
+      <w:r>
+        <w:t>The 1833 revelation named "hot drinks," interpreted as coffee and tea — not "caffeine," a word and concept that wasn't part of the original text. So a fully observant Latter-day Saint can, without the slightest hypocrisy, decline a cappuccino and then order a large caffeinated cola or an energy drink. The church even issued a clarification some years ago confirming that caffeinated soft drinks are not prohibited, settling a debate members had wondered about for decades.</w:t>
+      </w:r>
+    </w:p>
+    <w:p>
+      <w:pPr>
+        <w:pStyle w:val="Body"/>
+      </w:pPr>
+      <w:r>
+        <w:t>Is the line a little arbitrary from the outside — coffee forbidden, a bigger dose of caffeine in soda allowed? Honestly, yes, and thoughtful members will cheerfully admit it. But that's true of most religious dietary rules across most faiths. Keeping kosher, fasting for Ramadan, giving up meat on Fridays — the spiritual value lives less in the biochemistry than in the discipline of drawing a clear line and honoring it as an act of devotion.</w:t>
+      </w:r>
+    </w:p>
+    <w:p>
+      <w:pPr>
+        <w:pStyle w:val="Body"/>
+      </w:pPr>
+      <w:r>
+        <w:t>So the "contradiction" isn't really a contradiction once you see what the rule is actually about. It's a boundary, not a nutrition plan. And, as we'll see next, it's the reason a whole beloved beverage subculture sprang up.</w:t>
       </w:r>
     </w:p>
     <w:p>
@@ -3742,31 +3751,96 @@
         <w:pStyle w:val="Body"/>
       </w:pPr>
       <w:r>
-        <w:t>The Word of Wisdom is the church's health code, and it is the umbrella that most of this section falls under. Recorded by Joseph Smith in 1833, it began as counsel and is now a requirement of full membership, checked at the temple-recommend interview.</w:t>
-      </w:r>
-    </w:p>
-    <w:p>
-      <w:pPr>
-        <w:pStyle w:val="Body"/>
-      </w:pPr>
-      <w:r>
-        <w:t>Its prohibitions are specific and short: no alcohol, no tobacco (a category the church has extended to include vaping and e-cigarettes), no coffee, and no tea — meaning black and green tea, the "hot drinks" of the original text. Herbal teas, which aren't made from the tea plant, are generally considered fine. Beyond the bans, the code encourages wholesome eating, grains and fresh produce, and using meat sparingly.</w:t>
-      </w:r>
-    </w:p>
-    <w:p>
-      <w:pPr>
-        <w:pStyle w:val="Body"/>
-      </w:pPr>
-      <w:r>
-        <w:t>Notably, that's the whole list. There is no broad system of dietary law here — nothing resembling kosher or halal rules, no forbidden foods beyond the named substances. A Latter-day Saint can eat pork, shellfish, or anything else without a second thought. The code is narrow, which is part of why it functions so well as a simple, memorable badge of membership.</w:t>
-      </w:r>
-    </w:p>
-    <w:p>
-      <w:pPr>
-        <w:pStyle w:val="Body"/>
-      </w:pPr>
-      <w:r>
-        <w:t>Members experience the Word of Wisdom as much more than a diet. It's a covenant and an identity practice — a daily reminder of who they are and what they've committed to. There's also a measurable public-health payoff: studies have repeatedly found lower rates of smoking-related disease and better health outcomes among observant Latter-day Saints, a side effect that the community understandably takes some pride in.</w:t>
+        <w:t>The Word of Wisdom is the Latter-day Saint health code — a set of dietary do's and don'ts that members treat as a commandment and a marker of their faith.</w:t>
+      </w:r>
+    </w:p>
+    <w:p>
+      <w:pPr>
+        <w:pStyle w:val="Body"/>
+      </w:pPr>
+      <w:r>
+        <w:t>Recorded by Joseph Smith in 1833 and now part of Latter-day Saint scripture, it was for a long stretch of the 1800s treated as good advice rather than a strict requirement; even early leaders weren't uniformly rigorous about it. Over the twentieth century it hardened into a firm standard, and today observing it is a condition of full participation, tied to temple attendance.</w:t>
+      </w:r>
+    </w:p>
+    <w:p>
+      <w:pPr>
+        <w:pStyle w:val="Body"/>
+      </w:pPr>
+      <w:r>
+        <w:t>The core prohibitions, as the church currently interprets them, are four:</w:t>
+      </w:r>
+    </w:p>
+    <w:p>
+      <w:pPr>
+        <w:pStyle w:val="ListBullet"/>
+        <w:jc w:val="left"/>
+      </w:pPr>
+      <w:r>
+        <w:rPr>
+          <w:b/>
+        </w:rPr>
+        <w:t>No alcohol</w:t>
+      </w:r>
+      <w:r>
+        <w:t>, in any amount</w:t>
+      </w:r>
+    </w:p>
+    <w:p>
+      <w:pPr>
+        <w:pStyle w:val="ListBullet"/>
+        <w:jc w:val="left"/>
+      </w:pPr>
+      <w:r>
+        <w:rPr>
+          <w:b/>
+        </w:rPr>
+        <w:t>No tobacco</w:t>
+      </w:r>
+      <w:r>
+        <w:t xml:space="preserve"> (extended today to vaping)</w:t>
+      </w:r>
+    </w:p>
+    <w:p>
+      <w:pPr>
+        <w:pStyle w:val="ListBullet"/>
+        <w:jc w:val="left"/>
+      </w:pPr>
+      <w:r>
+        <w:rPr>
+          <w:b/>
+        </w:rPr>
+        <w:t>No coffee</w:t>
+      </w:r>
+    </w:p>
+    <w:p>
+      <w:pPr>
+        <w:pStyle w:val="ListBullet"/>
+        <w:jc w:val="left"/>
+      </w:pPr>
+      <w:r>
+        <w:rPr>
+          <w:b/>
+        </w:rPr>
+        <w:t>No tea</w:t>
+      </w:r>
+      <w:r>
+        <w:t xml:space="preserve"> — meaning black and green tea; herbal teas are generally fine</w:t>
+      </w:r>
+    </w:p>
+    <w:p>
+      <w:pPr>
+        <w:pStyle w:val="Body"/>
+      </w:pPr>
+      <w:r>
+        <w:t>On the positive side — the part almost everyone forgets — it also encourages eating wholesome grains, fruits, and vegetables, using meat sparingly, and generally caring for the body, which Latter-day Saints regard as a gift from God and even a kind of personal temple.</w:t>
+      </w:r>
+    </w:p>
+    <w:p>
+      <w:pPr>
+        <w:pStyle w:val="Body"/>
+      </w:pPr>
+      <w:r>
+        <w:t>The deeper purpose isn't only physical health, though the health benefits are real and measurable. It's about covenant and distinctiveness: every time a member keeps the code, they're quietly performing their membership in a covenant people. That's why the exact contours matter less than the daily fact of the rule.</w:t>
       </w:r>
     </w:p>
     <w:p>
@@ -3782,31 +3856,31 @@
         <w:pStyle w:val="Body"/>
       </w:pPr>
       <w:r>
-        <w:t>Observant Latter-day Saints do not drink alcohol at all. It's one of the clearest prohibitions in the Word of Wisdom, and abstaining from it is a requirement for the temple recommend, so committed members treat it as non-negotiable.</w:t>
-      </w:r>
-    </w:p>
-    <w:p>
-      <w:pPr>
-        <w:pStyle w:val="Body"/>
-      </w:pPr>
-      <w:r>
-        <w:t>This is complete abstinence, not moderation. There is no allowance for wine with dinner or a beer at a barbecue — the standard is simply none. Even the sacrament, the equivalent of communion, uses water rather than wine, a practical adaptation to the health code. For a devout member, alcohol is as absent from life as coffee is.</w:t>
-      </w:r>
-    </w:p>
-    <w:p>
-      <w:pPr>
-        <w:pStyle w:val="Body"/>
-      </w:pPr>
-      <w:r>
-        <w:t>As with coffee, most lifelong members don't experience this as deprivation. Having never built the habit, they don't feel a pull toward it, and social life in Latter-day Saint communities is organized around activities that don't involve drinking. The absence is unremarkable from the inside.</w:t>
-      </w:r>
-    </w:p>
-    <w:p>
-      <w:pPr>
-        <w:pStyle w:val="Body"/>
-      </w:pPr>
-      <w:r>
-        <w:t>Of course, observance varies, and not everyone who identifies as Mormon keeps the standard perfectly. But for those who hold a temple recommend and consider themselves in full fellowship, sobriety is a defining and consistent feature of the faith. If you're hosting a Latter-day Saint, offering a non-alcoholic option is a simple and appreciated courtesy.</w:t>
+        <w:t>No. Observant Latter-day Saints don't drink alcohol at all — not beer, not wine, not champagne at a wedding toast, not a cocktail at a work event.</w:t>
+      </w:r>
+    </w:p>
+    <w:p>
+      <w:pPr>
+        <w:pStyle w:val="Body"/>
+      </w:pPr>
+      <w:r>
+        <w:t>Alcohol is prohibited by the Word of Wisdom, and for committed members the abstinence is total and lifelong. This isn't moderation or "only on special occasions"; it's a bright line drawn in adolescence and simply never crossed. A faithful Latter-day Saint adult has usually never had a sip of alcohol and has no intention of ever doing so.</w:t>
+      </w:r>
+    </w:p>
+    <w:p>
+      <w:pPr>
+        <w:pStyle w:val="Body"/>
+      </w:pPr>
+      <w:r>
+        <w:t>This shapes social life in ways outsiders notice quickly. The Latter-day Saint colleague orders a soda at the bar, passes on the champagne, and hosts parties where the drinks are sparkling cider and "dirty sodas." It's one reason the culture reads as so wholesome — and one reason Latter-day Saint communities post notably low rates of alcohol-related disease and harm.</w:t>
+      </w:r>
+    </w:p>
+    <w:p>
+      <w:pPr>
+        <w:pStyle w:val="Body"/>
+      </w:pPr>
+      <w:r>
+        <w:t>It can also create quiet social friction, especially for young members or those in heavy-drinking environments, who become visibly "different" without saying a word about religion. Most members experience that difference as a feature, not a bug — a small, wordless testimony. Even the church's sacrament (its version of communion) uses water rather than wine, precisely because of this code.</w:t>
       </w:r>
     </w:p>
     <w:p>
@@ -3822,31 +3896,31 @@
         <w:pStyle w:val="Body"/>
       </w:pPr>
       <w:r>
-        <w:t>"Dirty soda" is a customized fountain drink — a base soda dressed up with flavored syrups, fruit purées, and a splash of cream. A Diet Coke with coconut cream and lime, for instance. It has become a signature treat in Latter-day Saint culture, especially across Utah and the Mountain West.</w:t>
-      </w:r>
-    </w:p>
-    <w:p>
-      <w:pPr>
-        <w:pStyle w:val="Body"/>
-      </w:pPr>
-      <w:r>
-        <w:t>The reason traces straight back to the Word of Wisdom. With coffee and alcohol off the table, the neighborhood coffee shop and the after-work drink both needed a replacement. Caffeinated soda, which the code permits, stepped into that role — and enterprising shops turned it into an art form, building whole menus of elaborate, personalized concoctions served from drive-through soda counters.</w:t>
-      </w:r>
-    </w:p>
-    <w:p>
-      <w:pPr>
-        <w:pStyle w:val="Body"/>
-      </w:pPr>
-      <w:r>
-        <w:t>The result is a booming regional industry. Chains devoted entirely to dirty sodas have spread across Latter-day Saint strongholds, functioning socially the way cafés do elsewhere: a place to meet friends, take a break, or grab an afternoon lift. The drinks are sweet, colorful, and endlessly customizable, and ordering a complicated one is half the fun.</w:t>
-      </w:r>
-    </w:p>
-    <w:p>
-      <w:pPr>
-        <w:pStyle w:val="Body"/>
-      </w:pPr>
-      <w:r>
-        <w:t>It's a genuinely charming example of a religious rule shaping everyday culture in an unexpected direction. A restriction that outsiders might view as limiting has instead produced something playful and distinctive — a permitted indulgence elevated into a small local tradition. If you visit Utah, trying a dirty soda is one of the easiest ways to taste the culture firsthand.</w:t>
+        <w:t>"Dirty soda" is a customized soft drink — a base soda loaded with flavored syrups, fruit purées, and cream — and it became a booming business largely out of Latter-day Saint culture, for a very logical reason: it's the indulgence a coffee-free culture is allowed to enjoy.</w:t>
+      </w:r>
+    </w:p>
+    <w:p>
+      <w:pPr>
+        <w:pStyle w:val="Body"/>
+      </w:pPr>
+      <w:r>
+        <w:t>Think about it. If your faith rules out coffee, tea, and alcohol, but caffeinated soda is fair game, then the social ritual other cultures build around a café or a bar has to go somewhere. In heavily Latter-day Saint areas, it went to the soda shop. Whole chains sprang up selling elaborate combinations — a Dr Pepper with coconut cream and lime, a Sprite with raspberry purée — served at a drive-through window as an afternoon treat or a social outing.</w:t>
+      </w:r>
+    </w:p>
+    <w:p>
+      <w:pPr>
+        <w:pStyle w:val="Body"/>
+      </w:pPr>
+      <w:r>
+        <w:t>The trend has since spread well beyond Latter-day Saints and gone national, but its roots in Utah's beverage culture are unmistakable. When you see a "dirty soda" shop, you're looking at a small, sweet monument to the Word of Wisdom — the permitted pleasure of a people who don't do coffeehouses.</w:t>
+      </w:r>
+    </w:p>
+    <w:p>
+      <w:pPr>
+        <w:pStyle w:val="Body"/>
+      </w:pPr>
+      <w:r>
+        <w:t>It's a lovely example of how a religious rule quietly shapes an entire regional culture, right down to what people order on a Friday night.</w:t>
       </w:r>
     </w:p>
     <w:p>
@@ -3862,31 +3936,31 @@
         <w:pStyle w:val="Body"/>
       </w:pPr>
       <w:r>
-        <w:t>Beyond the Word of Wisdom's short list, no — there are no other formal dietary rules. This surprises people who assume a faith with a health code must also have an elaborate system of forbidden foods. Latter-day Saints don't.</w:t>
-      </w:r>
-    </w:p>
-    <w:p>
-      <w:pPr>
-        <w:pStyle w:val="Body"/>
-      </w:pPr>
-      <w:r>
-        <w:t>There is nothing like the kosher laws of Judaism or the halal rules of Islam. No foods are ritually unclean, no combinations are banned, no special preparation is required. A Latter-day Saint can eat bacon, shrimp, a cheeseburger, or a spicy curry with complete freedom. The only prohibitions are the named substances: alcohol, tobacco, coffee, and tea.</w:t>
-      </w:r>
-    </w:p>
-    <w:p>
-      <w:pPr>
-        <w:pStyle w:val="Body"/>
-      </w:pPr>
-      <w:r>
-        <w:t>The code does include gentle guidance rather than hard rules. It encourages wholesome, simple eating — grains, fruits, and vegetables — and counsels using meat "sparingly." But these are aspirational principles, not requirements checked at any interview, and observance of them varies widely from person to person. Plenty of members eat meat freely without any sense of wrongdoing.</w:t>
-      </w:r>
-    </w:p>
-    <w:p>
-      <w:pPr>
-        <w:pStyle w:val="Body"/>
-      </w:pPr>
-      <w:r>
-        <w:t>So in practical terms, if you're cooking for a Latter-day Saint guest, the guidance is refreshingly simple. Skip the alcohol, coffee, and tea, and everything else on the menu is fair game. There are no hidden restrictions to navigate and no special certifications to look for.</w:t>
+        <w:t>Not really. Beyond the Word of Wisdom's ban on coffee, tea, alcohol, and tobacco, Latter-day Saints have no broad dietary laws — nothing like kosher or halal rules.</w:t>
+      </w:r>
+    </w:p>
+    <w:p>
+      <w:pPr>
+        <w:pStyle w:val="Body"/>
+      </w:pPr>
+      <w:r>
+        <w:t>They eat pork, shellfish, and everything else; there are no forbidden foods, no ritual slaughter requirements, no restrictions on mixing certain ingredients. The Word of Wisdom does gently counsel eating meat "sparingly" and favoring grains, fruits, and vegetables, but this is treated more as wise guidance than as an enforced rule, and observance of that part varies widely from one family to the next.</w:t>
+      </w:r>
+    </w:p>
+    <w:p>
+      <w:pPr>
+        <w:pStyle w:val="Body"/>
+      </w:pPr>
+      <w:r>
+        <w:t>There is one more food-related practice worth knowing, though it isn't a restriction so much as a discipline: fasting. On the first Sunday of most months — "Fast Sunday" — observant members go without food and drink for two meals and donate the money they would have spent (or more) as a "fast offering" to help the poor. So a Latter-day Saint might occasionally decline lunch for spiritual reasons, but they're not carrying a list of banned ingredients.</w:t>
+      </w:r>
+    </w:p>
+    <w:p>
+      <w:pPr>
+        <w:pStyle w:val="Body"/>
+      </w:pPr>
+      <w:r>
+        <w:t>In short: if you're hosting Latter-day Saint guests, the only things to skip are coffee, tea, alcohol, and dishes built around them. The food itself needs no special handling — a point that pleasantly surprises most first-time hosts.</w:t>
       </w:r>
     </w:p>
     <w:p>
@@ -3902,31 +3976,40 @@
         <w:pStyle w:val="Body"/>
       </w:pPr>
       <w:r>
-        <w:t>They can, but church leaders discourage tattoos and extra piercings, and many members follow that counsel closely. It's important to understand the category here: this is guidance, not a commandment on the level of the Word of Wisdom or tithing.</w:t>
-      </w:r>
-    </w:p>
-    <w:p>
-      <w:pPr>
-        <w:pStyle w:val="Body"/>
-      </w:pPr>
-      <w:r>
-        <w:t>The counsel grows out of an ethic of treating the body as a sacred gift — a "temple," in the scriptural language members use. From that starting point, leaders have long advised against tattoos and have suggested limiting piercings, often citing a single pair of earrings for women as the recommended standard. The spirit of the advice is modesty and wholesomeness rather than a strict prohibition.</w:t>
-      </w:r>
-    </w:p>
-    <w:p>
-      <w:pPr>
-        <w:pStyle w:val="Body"/>
-      </w:pPr>
-      <w:r>
-        <w:t>Because this is counsel rather than a recommend-level requirement, observance varies far more than with coffee or alcohol. A member with a tattoo isn't barred from the temple or considered out of fellowship the way someone drinking would be. Many younger and convert members have tattoos, sometimes from before joining the church, and carry no stigma for it.</w:t>
-      </w:r>
-    </w:p>
-    <w:p>
-      <w:pPr>
-        <w:pStyle w:val="Body"/>
-      </w:pPr>
-      <w:r>
-        <w:t>So the honest answer is that this lives in the realm of strong cultural expectation. Devout, traditionally raised members will typically have no tattoos and minimal piercings, reflecting the counsel they grew up with. But it's a matter of encouraged practice and personal choice, not a bright line that determines standing in the faith.</w:t>
+        <w:t>They can — nothing physically stops them — but church leaders discourage tattoos and extra piercings, and many devout members follow that counsel closely.</w:t>
+      </w:r>
+    </w:p>
+    <w:p>
+      <w:pPr>
+        <w:pStyle w:val="Body"/>
+      </w:pPr>
+      <w:r>
+        <w:t xml:space="preserve">This falls into a different category than coffee or alcohol. The Word of Wisdom is a firm, temple-recommend-level commandment; guidance on tattoos and piercings is </w:t>
+      </w:r>
+      <w:r>
+        <w:rPr>
+          <w:i/>
+        </w:rPr>
+        <w:t>counsel</w:t>
+      </w:r>
+      <w:r>
+        <w:t xml:space="preserve"> — strong cultural advice rooted in the idea that the body is a sacred gift, a temple not to be permanently marked or over-adorned. Leaders have specifically encouraged members to avoid tattoos and to limit piercings (commonly framed as one pair of earrings for women, none for men).</w:t>
+      </w:r>
+    </w:p>
+    <w:p>
+      <w:pPr>
+        <w:pStyle w:val="Body"/>
+      </w:pPr>
+      <w:r>
+        <w:t>Because it's counsel rather than commandment, observance varies. A member with a tattoo isn't excommunicated or barred from the temple, and attitudes have softened somewhat, especially among younger members and in the global church. You'll meet devout Latter-day Saints with a tattoo they got before joining or simply chose to get, and it doesn't erase their standing.</w:t>
+      </w:r>
+    </w:p>
+    <w:p>
+      <w:pPr>
+        <w:pStyle w:val="Body"/>
+      </w:pPr>
+      <w:r>
+        <w:t>The distinction is the useful takeaway: Latter-day Saint "rules" come in tiers. Some (the Word of Wisdom, tithing, chastity) are firm requirements tied to temple worthiness. Others (tattoos, piercings, media choices) are matters of counsel and personal conscience, where sincere members land in somewhat different places.</w:t>
       </w:r>
     </w:p>
     <w:p>
@@ -3942,31 +4025,40 @@
         <w:pStyle w:val="Body"/>
       </w:pPr>
       <w:r>
-        <w:t>There's no formal rule against it, but church leaders have counseled members to avoid entertainment that is vulgar, violent, or sexually explicit, and R-rated films often get named as a shorthand for that. As with tattoos, this is guidance rather than a commandment tied to the temple recommend.</w:t>
-      </w:r>
-    </w:p>
-    <w:p>
-      <w:pPr>
-        <w:pStyle w:val="Body"/>
-      </w:pPr>
-      <w:r>
-        <w:t>The underlying principle is about guarding your mind and spirit — choosing wholesome media and steering clear of content that leaders describe as degrading or coarse. The "R-rated" label became a convenient cultural marker for this standard, especially among American members, even though the church has never issued a blanket ban on a specific rating.</w:t>
-      </w:r>
-    </w:p>
-    <w:p>
-      <w:pPr>
-        <w:pStyle w:val="Body"/>
-      </w:pPr>
-      <w:r>
-        <w:t>In practice, observance ranges widely. Some families treat avoiding R-rated films as a firm household rule; others focus on the content itself rather than the rating, reasoning that a violent PG-13 film might be worse than a thoughtful R-rated one. Streaming and international releases, where the American rating system doesn't even apply, have blurred the line further.</w:t>
-      </w:r>
-    </w:p>
-    <w:p>
-      <w:pPr>
-        <w:pStyle w:val="Body"/>
-      </w:pPr>
-      <w:r>
-        <w:t>So if a Latter-day Saint friend declines a movie night or checks the content beforehand, this is the ethic at work — a general commitment to wholesome entertainment rather than a rigid checklist. It's a cultural expectation held with real sincerity by many, but it varies from person to person and family to family.</w:t>
+        <w:t>There's no official ban, but church leaders have long counseled members to avoid R-rated films and other explicit media, and many committed Latter-day Saints take that seriously.</w:t>
+      </w:r>
+    </w:p>
+    <w:p>
+      <w:pPr>
+        <w:pStyle w:val="Body"/>
+      </w:pPr>
+      <w:r>
+        <w:t xml:space="preserve">Like tattoos, this is </w:t>
+      </w:r>
+      <w:r>
+        <w:rPr>
+          <w:i/>
+        </w:rPr>
+        <w:t>counsel</w:t>
+      </w:r>
+      <w:r>
+        <w:t xml:space="preserve"> rather than commandment — part of a broader ethic of guarding what you let into your mind and choosing wholesome entertainment. The concern is content (graphic violence, sex, and language), not the rating label itself, which is why the guidance is really about the underlying material rather than a magic letter. Some members follow it strictly and won't watch an R-rated film; others use their own judgment about specific movies; families draw the line in different places.</w:t>
+      </w:r>
+    </w:p>
+    <w:p>
+      <w:pPr>
+        <w:pStyle w:val="Body"/>
+      </w:pPr>
+      <w:r>
+        <w:t>Because it's a matter of personal conscience, you'll find a real range. A devout Latter-day Saint college student might skip a gory blockbuster on principle; another might watch a serious R-rated historical drama and think nothing of it. Neither is violating a commandment on the order of the Word of Wisdom.</w:t>
+      </w:r>
+    </w:p>
+    <w:p>
+      <w:pPr>
+        <w:pStyle w:val="Body"/>
+      </w:pPr>
+      <w:r>
+        <w:t>The practical point for outsiders: don't assume a Latter-day Saint friend can't or won't watch a given film — but do know that many prefer to avoid the most explicit content, and it's a kindness to keep that in mind when picking a group movie.</w:t>
       </w:r>
     </w:p>
     <w:p>
@@ -3982,31 +4074,31 @@
         <w:pStyle w:val="Body"/>
       </w:pPr>
       <w:r>
-        <w:t>For Latter-day Saints, Sunday is set apart for worship, rest, and family. The heart of it is attending church services, but the observance extends across the whole day as a deliberate pause from the ordinary rhythms of the week.</w:t>
-      </w:r>
-    </w:p>
-    <w:p>
-      <w:pPr>
-        <w:pStyle w:val="Body"/>
-      </w:pPr>
-      <w:r>
-        <w:t>That usually means avoiding commercial and secular activities when possible. Many members won't shop, dine out, or do their regular work on Sunday, reasoning that patronizing businesses draws others away from their own Sabbath. Youth sports, errands, and household projects are often set aside too. The goal is to keep the day distinct rather than to fill it with a list of prohibitions.</w:t>
-      </w:r>
-    </w:p>
-    <w:p>
-      <w:pPr>
-        <w:pStyle w:val="Body"/>
-      </w:pPr>
-      <w:r>
-        <w:t>What fills the space instead is worship and connection. After church, families commonly spend the day together — sharing a meal, visiting relatives, writing to missionaries, reading scripture, or resting. It's meant to be restorative rather than restrictive, a weekly reset built around the things members value most.</w:t>
-      </w:r>
-    </w:p>
-    <w:p>
-      <w:pPr>
-        <w:pStyle w:val="Body"/>
-      </w:pPr>
-      <w:r>
-        <w:t>As with much of this section, observance varies. Some keep the day strictly, declining even to fill the gas tank; others are more relaxed, especially given the realities of jobs that require weekend shifts. But the ideal is widely shared: one day a week deliberately turned away from consumption and toward faith and family. If you're planning around a Latter-day Saint friend's schedule, keeping Sunday free is a safe assumption.</w:t>
+        <w:t>For Latter-day Saints, Sunday is a day set apart for worship, rest, and family — and many go out of their way to keep it free of ordinary work, shopping, and recreation.</w:t>
+      </w:r>
+    </w:p>
+    <w:p>
+      <w:pPr>
+        <w:pStyle w:val="Body"/>
+      </w:pPr>
+      <w:r>
+        <w:t>The centerpiece is church: a two-hour block of meetings including the sacrament service. But Sabbath observance extends beyond the building. Devout members often avoid shopping, dining out, paid work, and sometimes sports or big entertainment outings on Sunday, treating the day as a deliberate pause from the commercial week. Instead they'll spend it on family time, visiting the sick or elderly, service, scripture study, and rest. In heavily Latter-day Saint areas, you'll notice quieter stores and emptier restaurants on Sundays.</w:t>
+      </w:r>
+    </w:p>
+    <w:p>
+      <w:pPr>
+        <w:pStyle w:val="Body"/>
+      </w:pPr>
+      <w:r>
+        <w:t>How strictly this is kept varies by family and person. Some draw firm lines (no shopping, period); others are more flexible. Church-owned businesses and institutions famously close on Sundays as a matter of principle.</w:t>
+      </w:r>
+    </w:p>
+    <w:p>
+      <w:pPr>
+        <w:pStyle w:val="Body"/>
+      </w:pPr>
+      <w:r>
+        <w:t>For someone interacting with Latter-day Saints, the useful thing to know is that many will decline Sunday work events, sports leagues, or shopping trips — not out of judgment of you, but out of their own commitment to the day. Offering a Saturday alternative is a small, appreciated courtesy.</w:t>
       </w:r>
     </w:p>
     <w:p>
@@ -4022,31 +4114,31 @@
         <w:pStyle w:val="Body"/>
       </w:pPr>
       <w:r>
-        <w:t>Yes. Tithing — a full ten percent of one's income given to the church — is a genuine and central practice, and it's a requirement for full standing. Along with the Word of Wisdom, it's one of the questions asked directly in the temple-recommend interview.</w:t>
-      </w:r>
-    </w:p>
-    <w:p>
-      <w:pPr>
-        <w:pStyle w:val="Body"/>
-      </w:pPr>
-      <w:r>
-        <w:t>The practice is taken seriously and understood as a commandment rather than a suggested donation. Members calculate ten percent of their income and pay it regularly, whether monthly or per paycheck, and doing so faithfully is part of what qualifies someone as a fully participating member. It's a substantial commitment, and members make it across every income level.</w:t>
-      </w:r>
-    </w:p>
-    <w:p>
-      <w:pPr>
-        <w:pStyle w:val="Body"/>
-      </w:pPr>
-      <w:r>
-        <w:t>There's some individual latitude in the details — whether you tithe on gross or net income, for example, is generally left to personal conscience. But the principle itself is firm, and members widely regard it as an act of faith and trust rather than a mere financial transaction. Many describe deep meaning in giving even when money is tight.</w:t>
-      </w:r>
-    </w:p>
-    <w:p>
-      <w:pPr>
-        <w:pStyle w:val="Body"/>
-      </w:pPr>
-      <w:r>
-        <w:t>The funds support the church's operations worldwide: building and maintaining meetinghouses and temples, funding the missionary program, and running the faith's education and welfare efforts. Because members give without expectation of a detailed accounting, tithing also functions as an expression of trust in church leadership. For a committed Latter-day Saint, it's simply a normal, expected part of belonging.</w:t>
+        <w:t>Yes. Faithful Latter-day Saints pay tithing — a full ten percent of their income — and it's not a suggested target but a requirement of full standing in the church.</w:t>
+      </w:r>
+    </w:p>
+    <w:p>
+      <w:pPr>
+        <w:pStyle w:val="Body"/>
+      </w:pPr>
+      <w:r>
+        <w:t>This is one of the most serious and universal commitments in Latter-day Saint life, paid by rich and poor alike, from a teenager's first paycheck to a retiree's pension. It's calculated on income, which makes it just as demanding for a struggling family as for a wealthy one, and it's tied directly to the temple recommend: you can't answer the interview honestly and hold one without paying a full tithe.</w:t>
+      </w:r>
+    </w:p>
+    <w:p>
+      <w:pPr>
+        <w:pStyle w:val="Body"/>
+      </w:pPr>
+      <w:r>
+        <w:t>Where does it go? To building and maintaining thousands of meetinghouses and temples, funding the missionary program, producing materials in scores of languages, running the church's universities, and supporting a large and widely admired welfare and humanitarian system. Because local clergy are unpaid volunteers, none of it goes to local salaries.</w:t>
+      </w:r>
+    </w:p>
+    <w:p>
+      <w:pPr>
+        <w:pStyle w:val="Body"/>
+      </w:pPr>
+      <w:r>
+        <w:t>Members generally describe tithing not as a burden but as an act of faith that brings them peace — putting God first in the household budget. Critics point to the church's enormous accumulated reserves and its lack of financial transparency and ask harder questions about where all that money ultimately sits. Both things can be true: the tithe-paying widow's sacrifice is real, and the questions about the multibillion-dollar reserves are fair. Either way, the ten percent itself is very real, and very much a defining feature of the faith.</w:t>
       </w:r>
     </w:p>
     <w:p>

</xml_diff>